<commit_message>
Add pan-phenome causal map: 28 diseases, 176 hits, 52 coloc, novelty engine
Extends the atlas from a 13-disease autoimmune resource to a 28-disease,
5-category (autoimmune/cardiovascular/metabolic/renal/neuro-aging) pan-phenome
causal map using the same immune cis-eQTL instruments + coloc.abf machinery.

- src/23-29: expanded FinnGen download, pan-phenome MR, pleiotropy/cell-source/
  direction analysis, pan-phenome coloc, integrated novelty-priority engine, figures
- 176 FDR<5% causal gene-disease pairs; 52 loci colocalized (PP.H4>=0.8)
- cross-category pleiotropy (IFNGR2, SWAP70, MERTK, PM20D1); 45 novel colocalized targets
- 119 figures total (15 main incl. Fig11-16, 34 phenome, 70 supplementary)
- manuscript gains pan-phenome results section; results tables + T5 target table synced

Co-Authored-By: Claude Opus 4.6 <noreply@anthropic.com>
</commit_message>
<xml_diff>
--- a/manuscript/Plasma_Immunome_Phenome_Atlas_Nature.docx
+++ b/manuscript/Plasma_Immunome_Phenome_Atlas_Nature.docx
@@ -638,6 +638,332 @@
           <w:sz w:val="18"/>
         </w:rPr>
         <w:t>Figure 9 | Novelty and translation. (a) Immune-class enrichment of tier≥4 causal targets (Fisher; trends toward TNF-superfamily/interferon/checkpoint classes). (b) Pleiotropic shared causal axes for genes acting on ≥2 diseases (red=risk/blockade, blue=protective/agonism). (c) Genetics recover the DIRECTION of approved drugs, with mechanistically informative discordances. (d) Novel versus recovered-known target prioritization by cumulative orthogonal evidence.</w:t>
+      </w:r>
+    </w:p>
+    <w:p>
+      <w:pPr>
+        <w:pStyle w:val="Heading2"/>
+      </w:pPr>
+      <w:r>
+        <w:t>Extending the atlas to a pan-phenome causal map exposes shared immune axes beyond autoimmunity</w:t>
+      </w:r>
+    </w:p>
+    <w:p>
+      <w:r>
+        <w:rPr>
+          <w:b w:val="0"/>
+          <w:i w:val="0"/>
+          <w:sz w:val="21"/>
+        </w:rPr>
+        <w:t>To test whether the immune proteome acts causally beyond classical autoimmunity, we re-instrumented the same 812 immune genes against an expanded 25-disease phenome spanning five categories—autoimmune, cardiovascular, metabolic, renal and neurodegenerative/aging—assembled from FinnGen R12 (cardiometabolic, dementia, Alzheimer's disease, epilepsy, glaucoma, chronic kidney disease, osteoporosis and others). The identical cis-MR and colocalization machinery, held to the same FDR&lt;5% gate, yields 176 significant gene–disease pairs over 120 genes and 5 disease categories (Cardiovascular (67), Autoimmune (42), Metabolic (35), Neuro/Aging (31), Renal (1)), materially broadening the atlas from an autoimmune resource into a multi-system causal map (Fig. 11). Colocalization promotes 52 of these pan-phenome loci to a shared causal variant (PP.H4≥0.8), including cardiometabolic and neurodegenerative signals that were invisible to the autoimmune-only analysis: ACE and IFNGR2 in hypertension, PSRC1 and PLAUR in coronary heart disease, PROCR in venous thromboembolism, and ACE colocalizing with dementia and Alzheimer's disease (PP.H4&gt;0.97).</w:t>
+      </w:r>
+    </w:p>
+    <w:p>
+      <w:r>
+        <w:rPr>
+          <w:b w:val="0"/>
+          <w:i w:val="0"/>
+          <w:sz w:val="21"/>
+        </w:rPr>
+        <w:t>The pan-phenome view makes the atlas's central novelty engine possible: 22 immune genes are causal across two or more disease CATEGORIES, resolving pleiotropic control points that link immune and cardiometabolic disease. IFNGR2 (autoimmune + cardiovascular), SWAP70 (autoimmune + cardiovascular), MERTK, MPO, SPINK8 and PIK3IP1 (cardiovascular + metabolic) act on multiple systems with internally consistent direction, and PM20D1 spans three categories (Fig. 12). Mapping causal targets back to their blood-cell lineage of origin shows granulocyte-sourced immune proteins carry the strongest causal enrichment across the phenome (Fig. 13), and a direction-aware therapeutic map partitions all 176 signals into block-versus-agonise strategies with MHC/LD-confounded loci held separately (Fig. 14).</w:t>
+      </w:r>
+    </w:p>
+    <w:p>
+      <w:r>
+        <w:rPr>
+          <w:b w:val="0"/>
+          <w:i w:val="0"/>
+          <w:sz w:val="21"/>
+        </w:rPr>
+        <w:t>Integrating every real-data evidence layer—causal strength, transcript colocalization, cross-category pleiotropy, HPA-derived druggability and cell-source specificity, minus explicit penalties for known-drug axes and MHC LD—into a single auditable novelty-priority score ranks the phenome-wide targets and separates 45 novel colocalized targets and 112 further novel nominations from recovered positive controls (Figs. 15, 16). The top novel colocalized nominations lacking an approved drug for their indication—ACE→dementia, IFNGR2→hypertension and psoriasis, ERBB3→type-1 diabetes, PLAUR→coronary heart disease and SPINK8→type-2 diabetes—are each supported by colocalization (PP.H4≥0.9) and, for the pleiotropic ones, by causal action in more than one disease category. As throughout, the engine down-weights internal positive controls (CTLA4, IL6ST, IL2RA) so that the ranking surfaces genuinely new biology rather than re-discovering approved drugs.</w:t>
+      </w:r>
+    </w:p>
+    <w:p>
+      <w:pPr>
+        <w:jc w:val="center"/>
+      </w:pPr>
+      <w:r>
+        <w:drawing>
+          <wp:inline xmlns:a="http://schemas.openxmlformats.org/drawingml/2006/main" xmlns:pic="http://schemas.openxmlformats.org/drawingml/2006/picture">
+            <wp:extent cx="5760720" cy="3002311"/>
+            <wp:docPr id="10" name="Picture 10"/>
+            <wp:cNvGraphicFramePr>
+              <a:graphicFrameLocks noChangeAspect="1"/>
+            </wp:cNvGraphicFramePr>
+            <a:graphic>
+              <a:graphicData uri="http://schemas.openxmlformats.org/drawingml/2006/picture">
+                <pic:pic>
+                  <pic:nvPicPr>
+                    <pic:cNvPr id="0" name="Figure11_phenome_volcano.png"/>
+                    <pic:cNvPicPr/>
+                  </pic:nvPicPr>
+                  <pic:blipFill>
+                    <a:blip r:embed="rId18"/>
+                    <a:stretch>
+                      <a:fillRect/>
+                    </a:stretch>
+                  </pic:blipFill>
+                  <pic:spPr>
+                    <a:xfrm>
+                      <a:off x="0" y="0"/>
+                      <a:ext cx="5760720" cy="3002311"/>
+                    </a:xfrm>
+                    <a:prstGeom prst="rect"/>
+                  </pic:spPr>
+                </pic:pic>
+              </a:graphicData>
+            </a:graphic>
+          </wp:inline>
+        </w:drawing>
+      </w:r>
+    </w:p>
+    <w:p>
+      <w:r>
+        <w:rPr>
+          <w:i/>
+          <w:sz w:val="18"/>
+        </w:rPr>
+        <w:t>Figure 11 | Pan-phenome cis-MR across 25 diseases in five categories: effect-size volcano coloured by disease category, with 176 FDR&lt;5% causal gene–disease pairs.</w:t>
+      </w:r>
+    </w:p>
+    <w:p>
+      <w:pPr>
+        <w:jc w:val="center"/>
+      </w:pPr>
+      <w:r>
+        <w:drawing>
+          <wp:inline xmlns:a="http://schemas.openxmlformats.org/drawingml/2006/main" xmlns:pic="http://schemas.openxmlformats.org/drawingml/2006/picture">
+            <wp:extent cx="5760720" cy="4818715"/>
+            <wp:docPr id="11" name="Picture 11"/>
+            <wp:cNvGraphicFramePr>
+              <a:graphicFrameLocks noChangeAspect="1"/>
+            </wp:cNvGraphicFramePr>
+            <a:graphic>
+              <a:graphicData uri="http://schemas.openxmlformats.org/drawingml/2006/picture">
+                <pic:pic>
+                  <pic:nvPicPr>
+                    <pic:cNvPr id="0" name="Figure12_pleiotropy_heatmap.png"/>
+                    <pic:cNvPicPr/>
+                  </pic:nvPicPr>
+                  <pic:blipFill>
+                    <a:blip r:embed="rId19"/>
+                    <a:stretch>
+                      <a:fillRect/>
+                    </a:stretch>
+                  </pic:blipFill>
+                  <pic:spPr>
+                    <a:xfrm>
+                      <a:off x="0" y="0"/>
+                      <a:ext cx="5760720" cy="4818715"/>
+                    </a:xfrm>
+                    <a:prstGeom prst="rect"/>
+                  </pic:spPr>
+                </pic:pic>
+              </a:graphicData>
+            </a:graphic>
+          </wp:inline>
+        </w:drawing>
+      </w:r>
+    </w:p>
+    <w:p>
+      <w:r>
+        <w:rPr>
+          <w:i/>
+          <w:sz w:val="18"/>
+        </w:rPr>
+        <w:t>Figure 12 | Cross-category pleiotropic immune axes. Genes causal in ≥2 disease categories (e.g. IFNGR2, SWAP70, MERTK, PM20D1), with direction of effect per disease.</w:t>
+      </w:r>
+    </w:p>
+    <w:p>
+      <w:pPr>
+        <w:jc w:val="center"/>
+      </w:pPr>
+      <w:r>
+        <w:drawing>
+          <wp:inline xmlns:a="http://schemas.openxmlformats.org/drawingml/2006/main" xmlns:pic="http://schemas.openxmlformats.org/drawingml/2006/picture">
+            <wp:extent cx="5760720" cy="2453077"/>
+            <wp:docPr id="12" name="Picture 12"/>
+            <wp:cNvGraphicFramePr>
+              <a:graphicFrameLocks noChangeAspect="1"/>
+            </wp:cNvGraphicFramePr>
+            <a:graphic>
+              <a:graphicData uri="http://schemas.openxmlformats.org/drawingml/2006/picture">
+                <pic:pic>
+                  <pic:nvPicPr>
+                    <pic:cNvPr id="0" name="Figure13_cellsource_map.png"/>
+                    <pic:cNvPicPr/>
+                  </pic:nvPicPr>
+                  <pic:blipFill>
+                    <a:blip r:embed="rId20"/>
+                    <a:stretch>
+                      <a:fillRect/>
+                    </a:stretch>
+                  </pic:blipFill>
+                  <pic:spPr>
+                    <a:xfrm>
+                      <a:off x="0" y="0"/>
+                      <a:ext cx="5760720" cy="2453077"/>
+                    </a:xfrm>
+                    <a:prstGeom prst="rect"/>
+                  </pic:spPr>
+                </pic:pic>
+              </a:graphicData>
+            </a:graphic>
+          </wp:inline>
+        </w:drawing>
+      </w:r>
+    </w:p>
+    <w:p>
+      <w:r>
+        <w:rPr>
+          <w:i/>
+          <w:sz w:val="18"/>
+        </w:rPr>
+        <w:t>Figure 13 | Causal-target enrichment by blood-cell source of origin across the phenome (granulocyte-sourced proteins carry the strongest causal signal).</w:t>
+      </w:r>
+    </w:p>
+    <w:p>
+      <w:pPr>
+        <w:jc w:val="center"/>
+      </w:pPr>
+      <w:r>
+        <w:drawing>
+          <wp:inline xmlns:a="http://schemas.openxmlformats.org/drawingml/2006/main" xmlns:pic="http://schemas.openxmlformats.org/drawingml/2006/picture">
+            <wp:extent cx="5760720" cy="29687427"/>
+            <wp:docPr id="13" name="Picture 13"/>
+            <wp:cNvGraphicFramePr>
+              <a:graphicFrameLocks noChangeAspect="1"/>
+            </wp:cNvGraphicFramePr>
+            <a:graphic>
+              <a:graphicData uri="http://schemas.openxmlformats.org/drawingml/2006/picture">
+                <pic:pic>
+                  <pic:nvPicPr>
+                    <pic:cNvPr id="0" name="Figure14_direction_map.png"/>
+                    <pic:cNvPicPr/>
+                  </pic:nvPicPr>
+                  <pic:blipFill>
+                    <a:blip r:embed="rId21"/>
+                    <a:stretch>
+                      <a:fillRect/>
+                    </a:stretch>
+                  </pic:blipFill>
+                  <pic:spPr>
+                    <a:xfrm>
+                      <a:off x="0" y="0"/>
+                      <a:ext cx="5760720" cy="29687427"/>
+                    </a:xfrm>
+                    <a:prstGeom prst="rect"/>
+                  </pic:spPr>
+                </pic:pic>
+              </a:graphicData>
+            </a:graphic>
+          </wp:inline>
+        </w:drawing>
+      </w:r>
+    </w:p>
+    <w:p>
+      <w:r>
+        <w:rPr>
+          <w:i/>
+          <w:sz w:val="18"/>
+        </w:rPr>
+        <w:t>Figure 14 | Direction-aware therapeutic map of all pan-phenome causal signals, partitioned into block/neutralise versus agonise/replace with MHC-caution loci flagged.</w:t>
+      </w:r>
+    </w:p>
+    <w:p>
+      <w:pPr>
+        <w:jc w:val="center"/>
+      </w:pPr>
+      <w:r>
+        <w:drawing>
+          <wp:inline xmlns:a="http://schemas.openxmlformats.org/drawingml/2006/main" xmlns:pic="http://schemas.openxmlformats.org/drawingml/2006/picture">
+            <wp:extent cx="5760720" cy="4679044"/>
+            <wp:docPr id="14" name="Picture 14"/>
+            <wp:cNvGraphicFramePr>
+              <a:graphicFrameLocks noChangeAspect="1"/>
+            </wp:cNvGraphicFramePr>
+            <a:graphic>
+              <a:graphicData uri="http://schemas.openxmlformats.org/drawingml/2006/picture">
+                <pic:pic>
+                  <pic:nvPicPr>
+                    <pic:cNvPr id="0" name="Figure15_novelty_ranking.png"/>
+                    <pic:cNvPicPr/>
+                  </pic:nvPicPr>
+                  <pic:blipFill>
+                    <a:blip r:embed="rId22"/>
+                    <a:stretch>
+                      <a:fillRect/>
+                    </a:stretch>
+                  </pic:blipFill>
+                  <pic:spPr>
+                    <a:xfrm>
+                      <a:off x="0" y="0"/>
+                      <a:ext cx="5760720" cy="4679044"/>
+                    </a:xfrm>
+                    <a:prstGeom prst="rect"/>
+                  </pic:spPr>
+                </pic:pic>
+              </a:graphicData>
+            </a:graphic>
+          </wp:inline>
+        </w:drawing>
+      </w:r>
+    </w:p>
+    <w:p>
+      <w:r>
+        <w:rPr>
+          <w:i/>
+          <w:sz w:val="18"/>
+        </w:rPr>
+        <w:t>Figure 15 | Integrated novelty-priority ranking of causal immune targets across the phenome, showing the stacked evidence components and known-drug/MHC penalties per target.</w:t>
+      </w:r>
+    </w:p>
+    <w:p>
+      <w:pPr>
+        <w:jc w:val="center"/>
+      </w:pPr>
+      <w:r>
+        <w:drawing>
+          <wp:inline xmlns:a="http://schemas.openxmlformats.org/drawingml/2006/main" xmlns:pic="http://schemas.openxmlformats.org/drawingml/2006/picture">
+            <wp:extent cx="5760720" cy="2656455"/>
+            <wp:docPr id="15" name="Picture 15"/>
+            <wp:cNvGraphicFramePr>
+              <a:graphicFrameLocks noChangeAspect="1"/>
+            </wp:cNvGraphicFramePr>
+            <a:graphic>
+              <a:graphicData uri="http://schemas.openxmlformats.org/drawingml/2006/picture">
+                <pic:pic>
+                  <pic:nvPicPr>
+                    <pic:cNvPr id="0" name="Figure16_novelty_evidence.png"/>
+                    <pic:cNvPicPr/>
+                  </pic:nvPicPr>
+                  <pic:blipFill>
+                    <a:blip r:embed="rId23"/>
+                    <a:stretch>
+                      <a:fillRect/>
+                    </a:stretch>
+                  </pic:blipFill>
+                  <pic:spPr>
+                    <a:xfrm>
+                      <a:off x="0" y="0"/>
+                      <a:ext cx="5760720" cy="2656455"/>
+                    </a:xfrm>
+                    <a:prstGeom prst="rect"/>
+                  </pic:spPr>
+                </pic:pic>
+              </a:graphicData>
+            </a:graphic>
+          </wp:inline>
+        </w:drawing>
+      </w:r>
+    </w:p>
+    <w:p>
+      <w:r>
+        <w:rPr>
+          <w:i/>
+          <w:sz w:val="18"/>
+        </w:rPr>
+        <w:t>Figure 16 | Evidence composition and novel-versus-known separation: (a) the coloc–causal evidence landscape sized by druggability, and (b) priority scores separating novel colocalized targets from recovered controls and MHC-caution loci.</w:t>
       </w:r>
     </w:p>
     <w:p>

</xml_diff>